<commit_message>
Backup DiÃ¡rio AutomÃ¡tico: 2026-03-18 18:00:02
</commit_message>
<xml_diff>
--- a/modelos_prod/PropostaAvulso.docx
+++ b/modelos_prod/PropostaAvulso.docx
@@ -74,7 +74,7 @@
           <w:b/>
           <w:bCs/>
         </w:rPr>
-        <w:t>numero_proposta</w:t>
+        <w:t>${numero_proposta}</w:t>
       </w:r>
       <w:proofErr w:type="spellEnd"/>
       <w:r>
@@ -108,7 +108,7 @@
       </w:r>
       <w:proofErr w:type="spellStart"/>
       <w:r>
-        <w:t>DExrenso</w:t>
+        <w:t>${data_extenso}</w:t>
       </w:r>
       <w:proofErr w:type="spellEnd"/>
       <w:r>
@@ -159,7 +159,7 @@
       </w:r>
       <w:proofErr w:type="spellStart"/>
       <w:r>
-        <w:t>nome_cliente_salvo</w:t>
+        <w:t>${nome_cliente}</w:t>
       </w:r>
       <w:proofErr w:type="spellEnd"/>
       <w:r>
@@ -179,14 +179,14 @@
           <w:b/>
           <w:bCs/>
         </w:rPr>
-        <w:t>E-mail:</w:t>
+        <w:t>E-${email_cliente}:</w:t>
       </w:r>
       <w:r>
         <w:t xml:space="preserve"> ${</w:t>
       </w:r>
       <w:proofErr w:type="spellStart"/>
       <w:r>
-        <w:t>email_salvo</w:t>
+        <w:t>##TEMP_e${email_cliente}_salvo##</w:t>
       </w:r>
       <w:proofErr w:type="spellEnd"/>
       <w:r>
@@ -213,7 +213,7 @@
       </w:r>
       <w:proofErr w:type="spellStart"/>
       <w:r>
-        <w:t>telefone_salvo</w:t>
+        <w:t>${telefone_cliente}</w:t>
       </w:r>
       <w:proofErr w:type="spellEnd"/>
       <w:r>
@@ -240,7 +240,7 @@
       </w:r>
       <w:proofErr w:type="spellStart"/>
       <w:r>
-        <w:t>celular_salvo</w:t>
+        <w:t>${celular_cliente}</w:t>
       </w:r>
       <w:proofErr w:type="spellEnd"/>
       <w:r>
@@ -267,7 +267,7 @@
       </w:r>
       <w:proofErr w:type="spellStart"/>
       <w:r>
-        <w:t>whatsapp_salvo</w:t>
+        <w:t>##TEMP_${whatsapp_cliente}_salvo##</w:t>
       </w:r>
       <w:proofErr w:type="spellEnd"/>
       <w:r>
@@ -319,7 +319,7 @@
       </w:r>
       <w:proofErr w:type="spellStart"/>
       <w:r>
-        <w:t>endereco_obra</w:t>
+        <w:t>${endereco_obra}</w:t>
       </w:r>
       <w:proofErr w:type="spellEnd"/>
       <w:r>
@@ -346,7 +346,7 @@
       </w:r>
       <w:proofErr w:type="spellStart"/>
       <w:r>
-        <w:t>bairro_obra</w:t>
+        <w:t>${bairro_obra}</w:t>
       </w:r>
       <w:proofErr w:type="spellEnd"/>
       <w:r>
@@ -373,7 +373,7 @@
       </w:r>
       <w:proofErr w:type="spellStart"/>
       <w:r>
-        <w:t>cidade_obra</w:t>
+        <w:t>${cidade_obra}</w:t>
       </w:r>
       <w:proofErr w:type="spellEnd"/>
       <w:r>
@@ -400,7 +400,7 @@
       </w:r>
       <w:proofErr w:type="spellStart"/>
       <w:r>
-        <w:t>estado_obra</w:t>
+        <w:t>${estado_obra}</w:t>
       </w:r>
       <w:proofErr w:type="spellEnd"/>
       <w:r>
@@ -445,7 +445,7 @@
           <w:b/>
           <w:bCs/>
         </w:rPr>
-        <w:t>${Empresa}</w:t>
+        <w:t>##TEMP_${empresa_nome}##</w:t>
       </w:r>
       <w:r>
         <w:t xml:space="preserve"> é referência em serviços topográficos de alta precisão. Com vasta experiência e histórico sólido de projetos concluídos, garantimos segurança e exatidão em cada medição.</w:t>
@@ -497,7 +497,7 @@
           <w:i/>
           <w:iCs/>
         </w:rPr>
-        <w:t>${finalidade}</w:t>
+        <w:t>##TEMP_${finalidade_obra}##</w:t>
       </w:r>
     </w:p>
     <w:p>
@@ -593,7 +593,7 @@
         </w:numPr>
       </w:pPr>
       <w:r>
-        <w:t>ART – Anotação de Responsabilidade Técnica emitida pela ${Empresa}, cadastrada no CREA-MG.</w:t>
+        <w:t>ART – Anotação de Responsabilidade Técnica emitida pela ##TEMP_${empresa_nome}##, cadastrada no CREA-MG.</w:t>
       </w:r>
     </w:p>
     <w:p>
@@ -1096,7 +1096,7 @@
           <w:b/>
           <w:bCs/>
         </w:rPr>
-        <w:t>ValorProposta</w:t>
+        <w:t>${valor_total}</w:t>
       </w:r>
       <w:proofErr w:type="spellEnd"/>
       <w:r>
@@ -1112,7 +1112,7 @@
           <w:b/>
           <w:bCs/>
         </w:rPr>
-        <w:t>ValorExtenso</w:t>
+        <w:t>${valor_extenso}</w:t>
       </w:r>
       <w:proofErr w:type="spellEnd"/>
       <w:r>
@@ -1221,7 +1221,7 @@
       </w:r>
       <w:proofErr w:type="spellStart"/>
       <w:r>
-        <w:t>mobilizacao_valor</w:t>
+        <w:t>${valor_entrada}</w:t>
       </w:r>
       <w:proofErr w:type="spellEnd"/>
       <w:r>
@@ -1274,7 +1274,7 @@
       </w:r>
       <w:proofErr w:type="spellStart"/>
       <w:r>
-        <w:t>restante_valor</w:t>
+        <w:t>${valor_restante}</w:t>
       </w:r>
       <w:proofErr w:type="spellEnd"/>
       <w:r>
@@ -1395,7 +1395,7 @@
         <w:t>Titular:</w:t>
       </w:r>
       <w:r>
-        <w:t xml:space="preserve"> ${Empresa}</w:t>
+        <w:t xml:space="preserve"> ##TEMP_${empresa_nome}##</w:t>
       </w:r>
     </w:p>
     <w:p>
@@ -1410,10 +1410,10 @@
           <w:b/>
           <w:bCs/>
         </w:rPr>
-        <w:t>CNPJ:</w:t>
-      </w:r>
-      <w:r>
-        <w:t xml:space="preserve"> ${CNPJ}</w:t>
+        <w:t>${empresa_cnpj}:</w:t>
+      </w:r>
+      <w:r>
+        <w:t xml:space="preserve"> ##TEMP_${empresa_cnpj}##</w:t>
       </w:r>
     </w:p>
     <w:p>
@@ -1428,10 +1428,10 @@
           <w:b/>
           <w:bCs/>
         </w:rPr>
-        <w:t>Chave PIX:</w:t>
-      </w:r>
-      <w:r>
-        <w:t xml:space="preserve"> ${PIX}</w:t>
+        <w:t>Chave ${chave_pix}:</w:t>
+      </w:r>
+      <w:r>
+        <w:t xml:space="preserve"> ##TEMP_${chave_pix}##</w:t>
       </w:r>
     </w:p>
     <w:p>
@@ -1490,7 +1490,7 @@
           <w:b/>
           <w:bCs/>
         </w:rPr>
-        <w:t>${Empresa}</w:t>
+        <w:t>##TEMP_${empresa_nome}##</w:t>
       </w:r>
       <w:r>
         <w:t xml:space="preserve"> possui em seu DNA uma sólida experiência técnica na execução de serviços topográficos aplicados às mais diversas demandas da engenharia, infraestrutura e regularização territorial. Aliamos os fundamentos da topografia clássica às tecnologias modernas de aquisição e processamento de dados geoespaciais, garantindo resultados confiáveis e compatíveis com as exigências técnicas e normativas vigentes.</w:t>
@@ -1543,7 +1543,7 @@
           <w:bCs/>
         </w:rPr>
         <w:lastRenderedPageBreak/>
-        <w:t>${Empresa}</w:t>
+        <w:t>##TEMP_${empresa_nome}##</w:t>
       </w:r>
       <w:r>
         <w:t xml:space="preserve"> </w:t>
@@ -1562,7 +1562,7 @@
       </w:r>
       <w:proofErr w:type="spellStart"/>
       <w:r>
-        <w:t>whatsapp</w:t>
+        <w:t>${whatsapp_cliente}</w:t>
       </w:r>
       <w:proofErr w:type="spellEnd"/>
       <w:r>

</xml_diff>